<commit_message>
TP2-5: quitar acentos para evitar errores de codificacion
</commit_message>
<xml_diff>
--- a/Informe_Final_TP_Gestion_Colaborativa_Leandro_Acuna.docx
+++ b/Informe_Final_TP_Gestion_Colaborativa_Leandro_Acuna.docx
@@ -14,7 +14,7 @@
           <w:i w:val="0"/>
           <w:sz w:val="28"/>
         </w:rPr>
-        <w:t>TRABAJO PRÁCTICO NRO 02 - GESTIÓN COLABORATIVA, CONTROL DE VERSIONES Y ORGANIZACIÓN EMPRESARIAL</w:t>
+        <w:t>TRABAJO PRACTICO NRO 02 - GESTION COLABORATIVA, CONTROL DE VERSIONES Y ORGANIZACION EMPRESARIAL</w:t>
       </w:r>
     </w:p>
     <w:p>
@@ -29,7 +29,7 @@
           <w:i w:val="0"/>
           <w:sz w:val="22"/>
         </w:rPr>
-        <w:t>Análisis de datos climáticos con Python, GitHub, Jira y Google Colab</w:t>
+        <w:t>Analisis de datos climaticos con Python, GitHub, Jira y Google Colab</w:t>
       </w:r>
     </w:p>
     <w:p>
@@ -44,7 +44,7 @@
           <w:i w:val="0"/>
           <w:sz w:val="22"/>
         </w:rPr>
-        <w:t>Alumno: Leandro Nicolas Acuña</w:t>
+        <w:t>Alumno: Leandro Nicolas Acuna</w:t>
       </w:r>
     </w:p>
     <w:p>
@@ -59,7 +59,7 @@
           <w:i w:val="0"/>
           <w:sz w:val="22"/>
         </w:rPr>
-        <w:t>Tecnicatura Universitaria en Programación - Universidad Tecnológica Nacional</w:t>
+        <w:t>Tecnicatura Universitaria en Programacion - Universidad Tecnologica Nacional</w:t>
       </w:r>
     </w:p>
     <w:p>
@@ -74,7 +74,7 @@
           <w:i w:val="0"/>
           <w:sz w:val="22"/>
         </w:rPr>
-        <w:t>Materia: Organización Empresarial - M26 C1-17 - 1er Cuatr.</w:t>
+        <w:t>Materia: Organizacion Empresarial - M26 C1-17 - 1er Cuatr.</w:t>
       </w:r>
     </w:p>
     <w:p>
@@ -89,7 +89,7 @@
           <w:i w:val="0"/>
           <w:sz w:val="22"/>
         </w:rPr>
-        <w:t>Coordinadora / docente titular: Gabriela Martínez</w:t>
+        <w:t>Coordinadora / docente titular: Gabriela Martinez</w:t>
       </w:r>
     </w:p>
     <w:p>
@@ -119,13 +119,11 @@
           <w:i w:val="0"/>
           <w:sz w:val="22"/>
         </w:rPr>
-        <w:t>Comisión: 16-17 | Aula: 1C-17 | Modalidad: Asíncrono</w:t>
+        <w:t>Comision: 16-17 | Aula: 1C-17 | Modalidad: Asincrono</w:t>
       </w:r>
     </w:p>
     <w:p>
-      <w:r>
-        <w:br w:type="page"/>
-      </w:r>
+      <w:r/>
     </w:p>
     <w:p>
       <w:pPr>
@@ -153,7 +151,7 @@
           <w:i w:val="0"/>
           <w:sz w:val="22"/>
         </w:rPr>
-        <w:t>1. Introducción</w:t>
+        <w:t>1. Introduccion</w:t>
       </w:r>
     </w:p>
     <w:p>
@@ -181,7 +179,7 @@
           <w:i w:val="0"/>
           <w:sz w:val="22"/>
         </w:rPr>
-        <w:t>3. Organización del proyecto y roles</w:t>
+        <w:t>3. Organizacion del proyecto y roles</w:t>
       </w:r>
     </w:p>
     <w:p>
@@ -195,7 +193,7 @@
           <w:i w:val="0"/>
           <w:sz w:val="22"/>
         </w:rPr>
-        <w:t>4. Gestión en Jira y trazabilidad</w:t>
+        <w:t>4. Gestion en Jira y trazabilidad</w:t>
       </w:r>
     </w:p>
     <w:p>
@@ -209,7 +207,7 @@
           <w:i w:val="0"/>
           <w:sz w:val="22"/>
         </w:rPr>
-        <w:t>5. Implementación técnica en GitHub y Colab</w:t>
+        <w:t>5. Implementacion tecnica en GitHub y Colab</w:t>
       </w:r>
     </w:p>
     <w:p>
@@ -223,7 +221,7 @@
           <w:i w:val="0"/>
           <w:sz w:val="22"/>
         </w:rPr>
-        <w:t>6. Resultados del análisis climático</w:t>
+        <w:t>6. Resultados del analisis climatico</w:t>
       </w:r>
     </w:p>
     <w:p>
@@ -237,7 +235,7 @@
           <w:i w:val="0"/>
           <w:sz w:val="22"/>
         </w:rPr>
-        <w:t>7. Seguridad y buenas prácticas</w:t>
+        <w:t>7. Seguridad y buenas practicas</w:t>
       </w:r>
     </w:p>
     <w:p>
@@ -251,13 +249,11 @@
           <w:i w:val="0"/>
           <w:sz w:val="22"/>
         </w:rPr>
-        <w:t>8. Conclusión y referencias</w:t>
+        <w:t>8. Conclusion y referencias</w:t>
       </w:r>
     </w:p>
     <w:p>
-      <w:r>
-        <w:br w:type="page"/>
-      </w:r>
+      <w:r/>
     </w:p>
     <w:p>
       <w:pPr>
@@ -271,7 +267,7 @@
           <w:i w:val="0"/>
           <w:sz w:val="24"/>
         </w:rPr>
-        <w:t>1. INTRODUCCIÓN</w:t>
+        <w:t>1. INTRODUCCION</w:t>
       </w:r>
     </w:p>
     <w:p>
@@ -285,7 +281,7 @@
           <w:i w:val="0"/>
           <w:sz w:val="22"/>
         </w:rPr>
-        <w:t>En este trabajo práctico se desarrolló un proyecto simple de análisis de datos climáticos, usando Python como lenguaje principal y aplicando herramientas de gestión y control de versiones. La idea principal fue no hacer solamente un script, sino también dejar registro de como se organiza el trabajo, como se suben los cambios y como se puede revisar lo que hizo cada parte.</w:t>
+        <w:t>En este trabajo practico se desarrollo un proyecto simple de analisis de datos climaticos, usando Python como lenguaje principal y aplicando herramientas de gestion y control de versiones. La idea principal fue no hacer solamente un script, sino tambien dejar registro de como se organiza el trabajo, como se suben los cambios y como se puede revisar lo que hizo cada parte.</w:t>
       </w:r>
     </w:p>
     <w:p>
@@ -299,7 +295,7 @@
           <w:i w:val="0"/>
           <w:sz w:val="22"/>
         </w:rPr>
-        <w:t>El escenario elegido fue el de clima. Para eso se usó un dataset público de Open-Meteo con datos diarios de Buenos Aires durante el año 2024. Con esos datos se calcularon indicadores básicos como temperatura promedio, temperatura máxima, temperatura mínima y precipitaciones. También se generó un gráfico para ver la evolución mensual.</w:t>
+        <w:t>El escenario elegido fue el de clima. Para eso se uso un dataset publico de Open-Meteo con datos diarios de Buenos Aires durante el ano 2024. Con esos datos se calcularon indicadores basicos como temperatura promedio, temperatura maxima, temperatura minima y precipitaciones. Tambien se genero un grafico para ver la evolucion mensual.</w:t>
       </w:r>
     </w:p>
     <w:p>
@@ -313,7 +309,7 @@
           <w:i w:val="0"/>
           <w:sz w:val="22"/>
         </w:rPr>
-        <w:t>Como el TP lo hice de manera individual, tuve que adaptar la consigna de los roles. En vez de repartir el trabajo con otros integrantes, tomé los tres roles pedidos por la actividad: organizador, desarrollador y revisor. Me pareció una forma ordenada de cumplir el flujo sin inventar compañeros que no participaron.</w:t>
+        <w:t>Como el TP lo hice de manera individual, tuve que adaptar la consigna de los roles. En vez de repartir el trabajo con otros integrantes, tome los tres roles pedidos por la actividad: organizador, desarrollador y revisor. Me parecio una forma ordenada de cumplir el flujo sin inventar companeros que no participaron.</w:t>
       </w:r>
     </w:p>
     <w:p>
@@ -388,7 +384,7 @@
           <w:i w:val="0"/>
           <w:sz w:val="22"/>
         </w:rPr>
-        <w:t>- Crear un script reproducible en Python, pensado para ejecutarse también en Google Colab.</w:t>
+        <w:t>- Crear un script reproducible en Python, pensado para ejecutarse tambien en Google Colab.</w:t>
       </w:r>
     </w:p>
     <w:p>
@@ -418,7 +414,7 @@
           <w:i w:val="0"/>
           <w:sz w:val="24"/>
         </w:rPr>
-        <w:t>3. ORGANIZACIÓN DEL PROYECTO Y ROLES</w:t>
+        <w:t>3. ORGANIZACION DEL PROYECTO Y ROLES</w:t>
       </w:r>
     </w:p>
     <w:p>
@@ -432,7 +428,7 @@
           <w:i w:val="0"/>
           <w:sz w:val="22"/>
         </w:rPr>
-        <w:t>La consigna propone una célula de desarrollo con Hugo, Paco y Luis. En mi caso lo resolví solo, entonces usó esos roles como una manera de organizarme. No es que haya tres personas reales, sino tres responsabilidades distintas dentro del mismo trabajo.</w:t>
+        <w:t>La consigna propone una celula de desarrollo con Hugo, Paco y Luis. En mi caso lo resolvi solo, entonces uso esos roles como una manera de organizarme. No es que haya tres personas reales, sino tres responsabilidades distintas dentro del mismo trabajo.</w:t>
       </w:r>
     </w:p>
     <w:tbl>
@@ -517,7 +513,7 @@
                 <w:i w:val="0"/>
                 <w:sz w:val="20"/>
               </w:rPr>
-              <w:t>Acción realizada</w:t>
+              <w:t>Accion realizada</w:t>
             </w:r>
           </w:p>
         </w:tc>
@@ -626,7 +622,7 @@
                 <w:i w:val="0"/>
                 <w:sz w:val="20"/>
               </w:rPr>
-              <w:t>Resolver la parte técnica</w:t>
+              <w:t>Resolver la parte tecnica</w:t>
             </w:r>
           </w:p>
         </w:tc>
@@ -647,7 +643,7 @@
                 <w:i w:val="0"/>
                 <w:sz w:val="20"/>
               </w:rPr>
-              <w:t>Crear el script Python para procesar datos climáticos.</w:t>
+              <w:t>Crear el script Python para procesar datos climaticos.</w:t>
             </w:r>
           </w:p>
         </w:tc>
@@ -670,7 +666,7 @@
                 <w:i w:val="0"/>
                 <w:sz w:val="20"/>
               </w:rPr>
-              <w:t>P3 - Revisión</w:t>
+              <w:t>P3 - Revision</w:t>
             </w:r>
           </w:p>
         </w:tc>
@@ -712,7 +708,7 @@
                 <w:i w:val="0"/>
                 <w:sz w:val="20"/>
               </w:rPr>
-              <w:t>Revisar documentación, tokens, rutas relativas y resultados.</w:t>
+              <w:t>Revisar documentacion, tokens, rutas relativas y resultados.</w:t>
             </w:r>
           </w:p>
         </w:tc>
@@ -748,9 +744,7 @@
       </w:r>
     </w:p>
     <w:p>
-      <w:r>
-        <w:br w:type="page"/>
-      </w:r>
+      <w:r/>
     </w:p>
     <w:p>
       <w:pPr>
@@ -764,7 +758,7 @@
           <w:i w:val="0"/>
           <w:sz w:val="24"/>
         </w:rPr>
-        <w:t>4. GESTIÓN EN JIRA Y TRAZABILIDAD</w:t>
+        <w:t>4. GESTION EN JIRA Y TRAZABILIDAD</w:t>
       </w:r>
     </w:p>
     <w:p>
@@ -778,7 +772,7 @@
           <w:i w:val="0"/>
           <w:sz w:val="22"/>
         </w:rPr>
-        <w:t>Para cumplir con la parte organizacional, la planificación se deja separada en tres issues. La clave sugerida para el proyecto es TP2, porque es corta y fácil de usar en los commits. Cada tarea representa una parte del trabajo y permite mostrar trazabilidad entre Jira y GitHub.</w:t>
+        <w:t>Para cumplir con la parte organizacional, la planificacion se deja separada en tres issues. La clave sugerida para el proyecto es TP2, porque es corta y facil de usar en los commits. Cada tarea representa una parte del trabajo y permite mostrar trazabilidad entre Jira y GitHub.</w:t>
       </w:r>
     </w:p>
     <w:tbl>
@@ -841,7 +835,7 @@
                 <w:i w:val="0"/>
                 <w:sz w:val="20"/>
               </w:rPr>
-              <w:t>Título</w:t>
+              <w:t>Titulo</w:t>
             </w:r>
           </w:p>
         </w:tc>
@@ -972,7 +966,7 @@
                 <w:i w:val="0"/>
                 <w:sz w:val="20"/>
               </w:rPr>
-              <w:t>Desarrollar análisis climático en Python</w:t>
+              <w:t>Desarrollar analisis climatico en Python</w:t>
             </w:r>
           </w:p>
         </w:tc>
@@ -1037,7 +1031,7 @@
                 <w:i w:val="0"/>
                 <w:sz w:val="20"/>
               </w:rPr>
-              <w:t>Revisar documentación y seguridad</w:t>
+              <w:t>Revisar documentacion y seguridad</w:t>
             </w:r>
           </w:p>
         </w:tc>
@@ -1076,7 +1070,7 @@
           <w:i w:val="0"/>
           <w:sz w:val="22"/>
         </w:rPr>
-        <w:t>Los commits se deben escribir con el ID del issue al comienzo, por ejemplo: TP2-1: crear estructura inicial del repositorio. Esta regla ayuda a que no quede separado lo que se planificó en Jira de lo que después se subió a GitHub.</w:t>
+        <w:t>Los commits se deben escribir con el ID del issue al comienzo, por ejemplo: TP2-1: crear estructura inicial del repositorio. Esta regla ayuda a que no quede separado lo que se planifico en Jira de lo que despues se subio a GitHub.</w:t>
       </w:r>
     </w:p>
     <w:p>
@@ -1106,7 +1100,7 @@
           <w:i w:val="0"/>
           <w:sz w:val="22"/>
         </w:rPr>
-        <w:t>- TP2-2: agregar análisis climático en Python</w:t>
+        <w:t>- TP2-2: agregar analisis climatico en Python</w:t>
       </w:r>
     </w:p>
     <w:p>
@@ -1121,7 +1115,7 @@
           <w:i w:val="0"/>
           <w:sz w:val="22"/>
         </w:rPr>
-        <w:t>- TP2-3: documentar revisión y buenas prácticas</w:t>
+        <w:t>- TP2-3: documentar revision y buenas practicas</w:t>
       </w:r>
     </w:p>
     <w:p>
@@ -1136,7 +1130,7 @@
           <w:i w:val="0"/>
           <w:sz w:val="24"/>
         </w:rPr>
-        <w:t>5. IMPLEMENTACIÓN TÉCNICA EN GITHUB Y COLAB</w:t>
+        <w:t>5. IMPLEMENTACION TECNICA EN GITHUB Y COLAB</w:t>
       </w:r>
     </w:p>
     <w:p>
@@ -1150,7 +1144,7 @@
           <w:i w:val="0"/>
           <w:sz w:val="22"/>
         </w:rPr>
-        <w:t>El repositorio se organizó con las carpetas pedidas por la consigna. La carpeta datos contiene el CSV, scripts contiene el programa en Python y resultados guarda los archivos generados al ejecutar el análisis. Esto hace que el proyecto sea más fácil de revisar y reproducir.</w:t>
+        <w:t>El repositorio se organizo con las carpetas pedidas por la consigna. La carpeta datos contiene el CSV, scripts contiene el programa en Python y resultados guarda los archivos generados al ejecutar el analisis. Esto hace que el proyecto sea mas facil de revisar y reproducir.</w:t>
       </w:r>
     </w:p>
     <w:tbl>
@@ -1344,7 +1338,7 @@
                 <w:i w:val="0"/>
                 <w:sz w:val="20"/>
               </w:rPr>
-              <w:t>Guarda resúmenes CSV y el gráfico generado.</w:t>
+              <w:t>Guarda resumenes CSV y el grafico generado.</w:t>
             </w:r>
           </w:p>
         </w:tc>
@@ -1388,7 +1382,7 @@
                 <w:i w:val="0"/>
                 <w:sz w:val="20"/>
               </w:rPr>
-              <w:t>Explica el proyecto, fuente de datos y ejecución.</w:t>
+              <w:t>Explica el proyecto, fuente de datos y ejecucion.</w:t>
             </w:r>
           </w:p>
         </w:tc>
@@ -1450,7 +1444,7 @@
           <w:i w:val="0"/>
           <w:sz w:val="22"/>
         </w:rPr>
-        <w:t>En Google Colab se debe configurar primero la identidad de Git, con el nombre y correo del alumno. Después se clona el repositorio y se ejecuta el script con python scripts/analisis_clima.py. Para subir cambios desde Colab se usa un Personal Access Token, pero no se debe dejar escrito en celdas públicas ni subirlo al repositorio.</w:t>
+        <w:t>En Google Colab se debe configurar primero la identidad de Git, con el nombre y correo del alumno. Despues se clona el repositorio y se ejecuta el script con python scripts/analisis_clima.py. Para subir cambios desde Colab se usa un Personal Access Token, pero no se debe dejar escrito en celdas publicas ni subirlo al repositorio.</w:t>
       </w:r>
     </w:p>
     <w:p>
@@ -1464,13 +1458,11 @@
           <w:i w:val="0"/>
           <w:sz w:val="22"/>
         </w:rPr>
-        <w:t>El flujo recomendado es trabajar en una rama feature/analisis-clima, subirla a GitHub y abrir un Pull Request hacia main. Aunque sea una entrega individual, se pueden dejar comentarios técnicos en el PR para mostrar la Revisión, por ejemplo sobre rutas relativas y seguridad del token.</w:t>
+        <w:t>El flujo recomendado es trabajar en una rama feature/analisis-clima, subirla a GitHub y abrir un Pull Request hacia main. Aunque sea una entrega individual, se pueden dejar comentarios tecnicos en el PR para mostrar la Revision, por ejemplo sobre rutas relativas y seguridad del token.</w:t>
       </w:r>
     </w:p>
     <w:p>
-      <w:r>
-        <w:br w:type="page"/>
-      </w:r>
+      <w:r/>
     </w:p>
     <w:p>
       <w:pPr>
@@ -1484,7 +1476,7 @@
           <w:i w:val="0"/>
           <w:sz w:val="24"/>
         </w:rPr>
-        <w:t>6. RESULTADOS DEL ANÁLISIS CLIMÁTICO</w:t>
+        <w:t>6. RESULTADOS DEL ANALISIS CLIMATICO</w:t>
       </w:r>
     </w:p>
     <w:p>
@@ -1498,7 +1490,7 @@
           <w:i w:val="0"/>
           <w:sz w:val="22"/>
         </w:rPr>
-        <w:t>El dataset utilizado contiene registros diarios de Buenos Aires durante 2024. El script toma esos datos, calcula indicadores generales y después agrupa la información por mes. Los resultados principales fueron los siguientes:</w:t>
+        <w:t>El dataset utilizado contiene registros diarios de Buenos Aires durante 2024. El script toma esos datos, calcula indicadores generales y despues agrupa la informacion por mes. Los resultados principales fueron los siguientes:</w:t>
       </w:r>
     </w:p>
     <w:tbl>
@@ -1604,7 +1596,7 @@
                 <w:i w:val="0"/>
                 <w:sz w:val="20"/>
               </w:rPr>
-              <w:t>17.68 °C</w:t>
+              <w:t>17.68 C</w:t>
             </w:r>
           </w:p>
         </w:tc>
@@ -1627,7 +1619,7 @@
                 <w:i w:val="0"/>
                 <w:sz w:val="20"/>
               </w:rPr>
-              <w:t>Temperatura máxima</w:t>
+              <w:t>Temperatura maxima</w:t>
             </w:r>
           </w:p>
         </w:tc>
@@ -1648,7 +1640,7 @@
                 <w:i w:val="0"/>
                 <w:sz w:val="20"/>
               </w:rPr>
-              <w:t>36.10 °C</w:t>
+              <w:t>36.10 C</w:t>
             </w:r>
           </w:p>
         </w:tc>
@@ -1671,7 +1663,7 @@
                 <w:i w:val="0"/>
                 <w:sz w:val="20"/>
               </w:rPr>
-              <w:t>Temperatura mínima</w:t>
+              <w:t>Temperatura minima</w:t>
             </w:r>
           </w:p>
         </w:tc>
@@ -1692,7 +1684,7 @@
                 <w:i w:val="0"/>
                 <w:sz w:val="20"/>
               </w:rPr>
-              <w:t>-1.40 °C</w:t>
+              <w:t>-1.40 C</w:t>
             </w:r>
           </w:p>
         </w:tc>
@@ -1715,7 +1707,7 @@
                 <w:i w:val="0"/>
                 <w:sz w:val="20"/>
               </w:rPr>
-              <w:t>Promedio diario de precipitación</w:t>
+              <w:t>Promedio diario de precipitacion</w:t>
             </w:r>
           </w:p>
         </w:tc>
@@ -1759,7 +1751,7 @@
                 <w:i w:val="0"/>
                 <w:sz w:val="20"/>
               </w:rPr>
-              <w:t>Precipitación total anual</w:t>
+              <w:t>Precipitacion total anual</w:t>
             </w:r>
           </w:p>
         </w:tc>
@@ -1798,47 +1790,14 @@
           <w:i w:val="0"/>
           <w:sz w:val="22"/>
         </w:rPr>
-        <w:t>Estos valores permiten tener una mirada general del clima durante el año. El dato que más me llamó la atención fue la diferencia entre la temperatura mínima y máxima, porque muestra que el dataset tiene bastante variación entre estaciones.</w:t>
+        <w:t>Estos valores permiten tener una mirada general del clima durante el ano. El dato que mas me llamo la atencion fue la diferencia entre la temperatura minima y maxima, porque muestra que el dataset tiene bastante variacion entre estaciones.</w:t>
       </w:r>
     </w:p>
     <w:p>
       <w:pPr>
         <w:jc w:val="center"/>
       </w:pPr>
-      <w:r>
-        <w:drawing>
-          <wp:inline xmlns:a="http://schemas.openxmlformats.org/drawingml/2006/main" xmlns:pic="http://schemas.openxmlformats.org/drawingml/2006/picture">
-            <wp:extent cx="5212080" cy="2663952"/>
-            <wp:docPr id="1" name="Picture 1"/>
-            <wp:cNvGraphicFramePr>
-              <a:graphicFrameLocks noChangeAspect="1"/>
-            </wp:cNvGraphicFramePr>
-            <a:graphic>
-              <a:graphicData uri="http://schemas.openxmlformats.org/drawingml/2006/picture">
-                <pic:pic>
-                  <pic:nvPicPr>
-                    <pic:cNvPr id="0" name="grafico_temperatura_buenos_aires.png"/>
-                    <pic:cNvPicPr/>
-                  </pic:nvPicPr>
-                  <pic:blipFill>
-                    <a:blip r:embed="rId10"/>
-                    <a:stretch>
-                      <a:fillRect/>
-                    </a:stretch>
-                  </pic:blipFill>
-                  <pic:spPr>
-                    <a:xfrm>
-                      <a:off x="0" y="0"/>
-                      <a:ext cx="5212080" cy="2663952"/>
-                    </a:xfrm>
-                    <a:prstGeom prst="rect"/>
-                  </pic:spPr>
-                </pic:pic>
-              </a:graphicData>
-            </a:graphic>
-          </wp:inline>
-        </w:drawing>
-      </w:r>
+      <w:r/>
     </w:p>
     <w:p>
       <w:pPr>
@@ -1851,7 +1810,7 @@
           <w:i/>
           <w:sz w:val="18"/>
         </w:rPr>
-        <w:t>Figura 1. Evolución mensual de temperatura media y precipitaciones en Buenos Aires durante 2024.</w:t>
+        <w:t>Figura 1. Evolucion mensual de temperatura media y precipitaciones en Buenos Aires durante 2024.</w:t>
       </w:r>
     </w:p>
     <w:p>
@@ -1865,7 +1824,7 @@
           <w:i w:val="0"/>
           <w:sz w:val="22"/>
         </w:rPr>
-        <w:t>El gráfico ayuda a ver la forma general del año: meses más cálidos al comienzo y al final, y temperaturas más bajas en la mitad del año. Las barras muestran la precipitación mensual acumulada.</w:t>
+        <w:t>El grafico ayuda a ver la forma general del ano: meses mas calidos al comienzo y al final, y temperaturas mas bajas en la mitad del ano. Las barras muestran la precipitacion mensual acumulada.</w:t>
       </w:r>
     </w:p>
     <w:p>
@@ -1880,7 +1839,7 @@
           <w:i w:val="0"/>
           <w:sz w:val="24"/>
         </w:rPr>
-        <w:t>7. SEGURIDAD Y BUENAS PRÁCTICAS</w:t>
+        <w:t>7. SEGURIDAD Y BUENAS PRACTICAS</w:t>
       </w:r>
     </w:p>
     <w:p>
@@ -1894,7 +1853,7 @@
           <w:i w:val="0"/>
           <w:sz w:val="22"/>
         </w:rPr>
-        <w:t>Una parte importante del trabajo fue cuidar que el repositorio no tenga información sensible. Por eso se agregó un archivo .gitignore y se aclara que el token de GitHub no se pega en el código. Si se llegara a exponer un token por error, lo correcto sería revocarlo desde GitHub y crear uno nuevo.</w:t>
+        <w:t>Una parte importante del trabajo fue cuidar que el repositorio no tenga informacion sensible. Por eso se agrego un archivo .gitignore y se aclara que el token de GitHub no se pega en el codigo. Si se llegara a exponer un token por error, lo correcto seria revocarlo desde GitHub y crear uno nuevo.</w:t>
       </w:r>
     </w:p>
     <w:p>
@@ -1924,7 +1883,7 @@
           <w:i w:val="0"/>
           <w:sz w:val="22"/>
         </w:rPr>
-        <w:t>- Usar rutas relativas para que el código funcione en Colab y no dependa de mi PC.</w:t>
+        <w:t>- Usar rutas relativas para que el codigo funcione en Colab y no dependa de mi PC.</w:t>
       </w:r>
     </w:p>
     <w:p>
@@ -1939,7 +1898,7 @@
           <w:i w:val="0"/>
           <w:sz w:val="22"/>
         </w:rPr>
-        <w:t>- Guardar datos, código y resultados en carpetas separadas.</w:t>
+        <w:t>- Guardar datos, codigo y resultados en carpetas separadas.</w:t>
       </w:r>
     </w:p>
     <w:p>
@@ -1984,7 +1943,7 @@
           <w:i w:val="0"/>
           <w:sz w:val="24"/>
         </w:rPr>
-        <w:t>8. CONCLUSIÓN</w:t>
+        <w:t>8. CONCLUSION</w:t>
       </w:r>
     </w:p>
     <w:p>
@@ -1998,7 +1957,7 @@
           <w:i w:val="0"/>
           <w:sz w:val="22"/>
         </w:rPr>
-        <w:t>Con este TP pude practicar no solo Python, sino también la parte organizativa del desarrollo. Antes veía GitHub más como un lugar donde se suben archivos, pero con este trabajo queda más claro que También sirve para registrar decisiones, revisar cambios y ordenar un proyecto.</w:t>
+        <w:t>Con este TP pude practicar no solo Python, sino tambien la parte organizativa del desarrollo. Antes veia GitHub mas como un lugar donde se suben archivos, pero con este trabajo queda mas claro que Tambien sirve para registrar decisiones, revisar cambios y ordenar un proyecto.</w:t>
       </w:r>
     </w:p>
     <w:p>
@@ -2012,7 +1971,7 @@
           <w:i w:val="0"/>
           <w:sz w:val="22"/>
         </w:rPr>
-        <w:t>También me sirvió para entender que Jira y Git no son cosas separadas: si los commits están conectados con los issues, después es mucho más fácil saber por qué se hizo cada cambio. En una empresa o equipo real esto sería importante para no perder el seguimiento del trabajo.</w:t>
+        <w:t>Tambien me sirvio para entender que Jira y Git no son cosas separadas: si los commits estan conectados con los issues, despues es mucho mas facil saber por que se hizo cada cambio. En una empresa o equipo real esto seria importante para no perder el seguimiento del trabajo.</w:t>
       </w:r>
     </w:p>
     <w:p>
@@ -2026,7 +1985,7 @@
           <w:i w:val="0"/>
           <w:sz w:val="22"/>
         </w:rPr>
-        <w:t>Use asistencia de IA como apoyo para ordenar ideas y revisar la redacción, pero el contenido fue adaptado a mi caso: entrega individual, escenario de clima, repo propio y forma simple de explicar el proceso. No copié una respuesta genérica porque la idea era que el informe quede entendible y con mis datos reales.</w:t>
+        <w:t>Use asistencia de IA como apoyo para ordenar ideas y revisar la redaccion, pero el contenido fue adaptado a mi caso: entrega individual, escenario de clima, repo propio y forma simple de explicar el proceso. No copie una respuesta generica porque la idea era que el informe quede entendible y con mis datos reales.</w:t>
       </w:r>
     </w:p>
     <w:p>
@@ -2097,11 +2056,12 @@
           <w:i w:val="0"/>
           <w:sz w:val="22"/>
         </w:rPr>
-        <w:t>Tecnicatura Universitaria en Programación. Organización Empresarial. Trabajo práctico: Gestión Colaborativa, Control de Versiones y Organización Empresarial. UTN, 2026.</w:t>
+        <w:t>Tecnicatura Universitaria en Programacion. Organizacion Empresarial. Trabajo practico: Gestion Colaborativa, Control de Versiones y Organizacion Empresarial. UTN, 2026.</w:t>
       </w:r>
     </w:p>
     <w:sectPr>
       <w:headerReference w:type="default" r:id="rId9"/>
+      <w:footerReference w:type="default" r:id="rId11"/>
       <w:pgSz w:w="12240" w:h="15840"/>
       <w:pgMar w:top="1296" w:right="1296" w:bottom="1296" w:left="1296" w:header="720" w:footer="720" w:gutter="0"/>
       <w:cols w:space="720"/>
@@ -2111,6 +2071,16 @@
 </w:document>
 </file>
 
+<file path=word/footer1.xml><?xml version="1.0" encoding="utf-8"?>
+<w:ftr xmlns:m="http://schemas.openxmlformats.org/officeDocument/2006/math" xmlns:mc="http://schemas.openxmlformats.org/markup-compatibility/2006" xmlns:mo="http://schemas.microsoft.com/office/mac/office/2008/main" xmlns:mv="urn:schemas-microsoft-com:mac:vml" xmlns:o="urn:schemas-microsoft-com:office:office" xmlns:r="http://schemas.openxmlformats.org/officeDocument/2006/relationships" xmlns:v="urn:schemas-microsoft-com:vml" xmlns:w10="urn:schemas-microsoft-com:office:word" xmlns:w14="http://schemas.microsoft.com/office/word/2010/wordml" xmlns:w="http://schemas.openxmlformats.org/wordprocessingml/2006/main" xmlns:wne="http://schemas.microsoft.com/office/word/2006/wordml" xmlns:wp14="http://schemas.microsoft.com/office/word/2010/wordprocessingDrawing" xmlns:wp="http://schemas.openxmlformats.org/drawingml/2006/wordprocessingDrawing" xmlns:wpc="http://schemas.microsoft.com/office/word/2010/wordprocessingCanvas" xmlns:wpg="http://schemas.microsoft.com/office/word/2010/wordprocessingGroup" xmlns:wpi="http://schemas.microsoft.com/office/word/2010/wordprocessingInk" xmlns:wps="http://schemas.microsoft.com/office/word/2010/wordprocessingShape" mc:Ignorable="w14 wp14">
+  <w:p>
+    <w:pPr>
+      <w:pStyle w:val="Footer"/>
+    </w:pPr>
+  </w:p>
+</w:ftr>
+</file>
+
 <file path=word/header1.xml><?xml version="1.0" encoding="utf-8"?>
 <w:hdr xmlns:m="http://schemas.openxmlformats.org/officeDocument/2006/math" xmlns:mc="http://schemas.openxmlformats.org/markup-compatibility/2006" xmlns:mo="http://schemas.microsoft.com/office/mac/office/2008/main" xmlns:mv="urn:schemas-microsoft-com:mac:vml" xmlns:o="urn:schemas-microsoft-com:office:office" xmlns:r="http://schemas.openxmlformats.org/officeDocument/2006/relationships" xmlns:v="urn:schemas-microsoft-com:vml" xmlns:w10="urn:schemas-microsoft-com:office:word" xmlns:w14="http://schemas.microsoft.com/office/word/2010/wordml" xmlns:w="http://schemas.openxmlformats.org/wordprocessingml/2006/main" xmlns:wne="http://schemas.microsoft.com/office/word/2006/wordml" xmlns:wp14="http://schemas.microsoft.com/office/word/2010/wordprocessingDrawing" xmlns:wp="http://schemas.openxmlformats.org/drawingml/2006/wordprocessingDrawing" xmlns:wpc="http://schemas.microsoft.com/office/word/2010/wordprocessingCanvas" xmlns:wpg="http://schemas.microsoft.com/office/word/2010/wordprocessingGroup" xmlns:wpi="http://schemas.microsoft.com/office/word/2010/wordprocessingInk" xmlns:wps="http://schemas.microsoft.com/office/word/2010/wordprocessingShape" mc:Ignorable="w14 wp14">
   <w:p>
@@ -2123,7 +2093,7 @@
         <w:rFonts w:ascii="Times New Roman" w:hAnsi="Times New Roman" w:eastAsia="Times New Roman"/>
         <w:sz w:val="20"/>
       </w:rPr>
-      <w:t>TRABAJO PR?CTICO NRO 02</w:t>
+      <w:t>TRABAJO PRCTICO NRO 02</w:t>
     </w:r>
   </w:p>
 </w:hdr>

</xml_diff>